<commit_message>
Done Day 5 6 7
</commit_message>
<xml_diff>
--- a/BT_Day06_PythonWeb.docx
+++ b/BT_Day06_PythonWeb.docx
@@ -8,70 +8,71 @@
         <w:ind w:right="0" w:left="0" w:firstLine="0"/>
         <w:jc w:val="center"/>
         <w:rPr>
-          <w:rFonts w:ascii="Calibri" w:hAnsi="Calibri" w:cs="Calibri" w:eastAsia="Calibri"/>
-          <w:color w:val="auto"/>
-          <w:spacing w:val="0"/>
-          <w:position w:val="0"/>
-          <w:sz w:val="28"/>
+          <w:rFonts w:ascii="Arial" w:hAnsi="Arial" w:cs="Arial" w:eastAsia="Arial"/>
+          <w:b/>
+          <w:color w:val="FF0000"/>
+          <w:spacing w:val="0"/>
+          <w:position w:val="0"/>
+          <w:sz w:val="32"/>
           <w:shd w:fill="auto" w:val="clear"/>
         </w:rPr>
       </w:pPr>
       <w:r>
         <w:rPr>
-          <w:rFonts w:ascii="Calibri" w:hAnsi="Calibri" w:cs="Calibri" w:eastAsia="Calibri"/>
-          <w:b/>
-          <w:color w:val="auto"/>
-          <w:spacing w:val="0"/>
-          <w:position w:val="0"/>
-          <w:sz w:val="28"/>
+          <w:rFonts w:ascii="Arial" w:hAnsi="Arial" w:cs="Arial" w:eastAsia="Arial"/>
+          <w:b/>
+          <w:color w:val="FF0000"/>
+          <w:spacing w:val="0"/>
+          <w:position w:val="0"/>
+          <w:sz w:val="32"/>
           <w:shd w:fill="auto" w:val="clear"/>
         </w:rPr>
         <w:t xml:space="preserve">PHI</w:t>
       </w:r>
       <w:r>
         <w:rPr>
-          <w:rFonts w:ascii="Calibri" w:hAnsi="Calibri" w:cs="Calibri" w:eastAsia="Calibri"/>
-          <w:b/>
-          <w:color w:val="auto"/>
-          <w:spacing w:val="0"/>
-          <w:position w:val="0"/>
-          <w:sz w:val="28"/>
+          <w:rFonts w:ascii="Arial" w:hAnsi="Arial" w:cs="Arial" w:eastAsia="Arial"/>
+          <w:b/>
+          <w:color w:val="FF0000"/>
+          <w:spacing w:val="0"/>
+          <w:position w:val="0"/>
+          <w:sz w:val="32"/>
           <w:shd w:fill="auto" w:val="clear"/>
         </w:rPr>
         <w:t xml:space="preserve">ẾU B</w:t>
       </w:r>
       <w:r>
         <w:rPr>
-          <w:rFonts w:ascii="Calibri" w:hAnsi="Calibri" w:cs="Calibri" w:eastAsia="Calibri"/>
-          <w:b/>
-          <w:color w:val="auto"/>
-          <w:spacing w:val="0"/>
-          <w:position w:val="0"/>
-          <w:sz w:val="28"/>
+          <w:rFonts w:ascii="Arial" w:hAnsi="Arial" w:cs="Arial" w:eastAsia="Arial"/>
+          <w:b/>
+          <w:color w:val="FF0000"/>
+          <w:spacing w:val="0"/>
+          <w:position w:val="0"/>
+          <w:sz w:val="32"/>
           <w:shd w:fill="auto" w:val="clear"/>
         </w:rPr>
         <w:t xml:space="preserve">ÀI T</w:t>
       </w:r>
       <w:r>
         <w:rPr>
-          <w:rFonts w:ascii="Calibri" w:hAnsi="Calibri" w:cs="Calibri" w:eastAsia="Calibri"/>
-          <w:b/>
-          <w:color w:val="auto"/>
-          <w:spacing w:val="0"/>
-          <w:position w:val="0"/>
-          <w:sz w:val="28"/>
+          <w:rFonts w:ascii="Arial" w:hAnsi="Arial" w:cs="Arial" w:eastAsia="Arial"/>
+          <w:b/>
+          <w:color w:val="FF0000"/>
+          <w:spacing w:val="0"/>
+          <w:position w:val="0"/>
+          <w:sz w:val="32"/>
           <w:shd w:fill="auto" w:val="clear"/>
         </w:rPr>
         <w:t xml:space="preserve">ẬP THỰC H</w:t>
       </w:r>
       <w:r>
         <w:rPr>
-          <w:rFonts w:ascii="Calibri" w:hAnsi="Calibri" w:cs="Calibri" w:eastAsia="Calibri"/>
-          <w:b/>
-          <w:color w:val="auto"/>
-          <w:spacing w:val="0"/>
-          <w:position w:val="0"/>
-          <w:sz w:val="28"/>
+          <w:rFonts w:ascii="Arial" w:hAnsi="Arial" w:cs="Arial" w:eastAsia="Arial"/>
+          <w:b/>
+          <w:color w:val="FF0000"/>
+          <w:spacing w:val="0"/>
+          <w:position w:val="0"/>
+          <w:sz w:val="32"/>
           <w:shd w:fill="auto" w:val="clear"/>
         </w:rPr>
         <w:t xml:space="preserve">ÀNH: FASTAPI PYDANTIC SCHEMAS</w:t>
@@ -83,22 +84,23 @@
         <w:ind w:right="0" w:left="0" w:firstLine="0"/>
         <w:jc w:val="center"/>
         <w:rPr>
-          <w:rFonts w:ascii="Calibri" w:hAnsi="Calibri" w:cs="Calibri" w:eastAsia="Calibri"/>
-          <w:color w:val="auto"/>
-          <w:spacing w:val="0"/>
-          <w:position w:val="0"/>
-          <w:sz w:val="28"/>
+          <w:rFonts w:ascii="Arial" w:hAnsi="Arial" w:cs="Arial" w:eastAsia="Arial"/>
+          <w:b/>
+          <w:color w:val="FF0000"/>
+          <w:spacing w:val="0"/>
+          <w:position w:val="0"/>
+          <w:sz w:val="32"/>
           <w:shd w:fill="auto" w:val="clear"/>
         </w:rPr>
       </w:pPr>
       <w:r>
         <w:rPr>
-          <w:rFonts w:ascii="Calibri" w:hAnsi="Calibri" w:cs="Calibri" w:eastAsia="Calibri"/>
-          <w:b/>
-          <w:color w:val="auto"/>
-          <w:spacing w:val="0"/>
-          <w:position w:val="0"/>
-          <w:sz w:val="28"/>
+          <w:rFonts w:ascii="Arial" w:hAnsi="Arial" w:cs="Arial" w:eastAsia="Arial"/>
+          <w:b/>
+          <w:color w:val="FF0000"/>
+          <w:spacing w:val="0"/>
+          <w:position w:val="0"/>
+          <w:sz w:val="32"/>
           <w:shd w:fill="auto" w:val="clear"/>
         </w:rPr>
         <w:t xml:space="preserve">&amp; CRUD ENDPOINTS (IN-MEMORY)</w:t>
@@ -106,7 +108,7 @@
     </w:p>
     <w:p>
       <w:pPr>
-        <w:spacing w:before="0" w:after="300" w:line="240"/>
+        <w:spacing w:before="0" w:after="0" w:line="240"/>
         <w:ind w:right="0" w:left="0" w:firstLine="0"/>
         <w:jc w:val="center"/>
         <w:rPr>
@@ -122,7 +124,7 @@
         <w:rPr>
           <w:rFonts w:ascii="Calibri" w:hAnsi="Calibri" w:cs="Calibri" w:eastAsia="Calibri"/>
           <w:i/>
-          <w:color w:val="auto"/>
+          <w:color w:val="64748B"/>
           <w:spacing w:val="0"/>
           <w:position w:val="0"/>
           <w:sz w:val="20"/>
@@ -134,7 +136,7 @@
         <w:rPr>
           <w:rFonts w:ascii="Calibri" w:hAnsi="Calibri" w:cs="Calibri" w:eastAsia="Calibri"/>
           <w:i/>
-          <w:color w:val="auto"/>
+          <w:color w:val="64748B"/>
           <w:spacing w:val="0"/>
           <w:position w:val="0"/>
           <w:sz w:val="20"/>
@@ -146,7 +148,7 @@
         <w:rPr>
           <w:rFonts w:ascii="Calibri" w:hAnsi="Calibri" w:cs="Calibri" w:eastAsia="Calibri"/>
           <w:i/>
-          <w:color w:val="auto"/>
+          <w:color w:val="64748B"/>
           <w:spacing w:val="0"/>
           <w:position w:val="0"/>
           <w:sz w:val="20"/>
@@ -158,7 +160,7 @@
         <w:rPr>
           <w:rFonts w:ascii="Calibri" w:hAnsi="Calibri" w:cs="Calibri" w:eastAsia="Calibri"/>
           <w:i/>
-          <w:color w:val="auto"/>
+          <w:color w:val="64748B"/>
           <w:spacing w:val="0"/>
           <w:position w:val="0"/>
           <w:sz w:val="20"/>
@@ -170,19 +172,19 @@
         <w:rPr>
           <w:rFonts w:ascii="Calibri" w:hAnsi="Calibri" w:cs="Calibri" w:eastAsia="Calibri"/>
           <w:i/>
-          <w:color w:val="auto"/>
+          <w:color w:val="64748B"/>
           <w:spacing w:val="0"/>
           <w:position w:val="0"/>
           <w:sz w:val="20"/>
           <w:shd w:fill="auto" w:val="clear"/>
         </w:rPr>
-        <w:t xml:space="preserve">àn thành: 20 - 25 phút | Bài t</w:t>
+        <w:t xml:space="preserve">àn thành: 30 - 40 phút | Bài t</w:t>
       </w:r>
       <w:r>
         <w:rPr>
           <w:rFonts w:ascii="Calibri" w:hAnsi="Calibri" w:cs="Calibri" w:eastAsia="Calibri"/>
           <w:i/>
-          <w:color w:val="auto"/>
+          <w:color w:val="64748B"/>
           <w:spacing w:val="0"/>
           <w:position w:val="0"/>
           <w:sz w:val="20"/>
@@ -194,7 +196,7 @@
         <w:rPr>
           <w:rFonts w:ascii="Calibri" w:hAnsi="Calibri" w:cs="Calibri" w:eastAsia="Calibri"/>
           <w:i/>
-          <w:color w:val="auto"/>
+          <w:color w:val="64748B"/>
           <w:spacing w:val="0"/>
           <w:position w:val="0"/>
           <w:sz w:val="20"/>
@@ -219,72 +221,72 @@
       </w:pPr>
       <w:r>
         <w:rPr>
-          <w:rFonts w:ascii="Calibri" w:hAnsi="Calibri" w:cs="Calibri" w:eastAsia="Calibri"/>
-          <w:b/>
-          <w:color w:val="auto"/>
-          <w:spacing w:val="0"/>
-          <w:position w:val="0"/>
-          <w:sz w:val="24"/>
+          <w:rFonts w:ascii="Arial" w:hAnsi="Arial" w:cs="Arial" w:eastAsia="Arial"/>
+          <w:b/>
+          <w:color w:val="auto"/>
+          <w:spacing w:val="0"/>
+          <w:position w:val="0"/>
+          <w:sz w:val="26"/>
           <w:shd w:fill="auto" w:val="clear"/>
         </w:rPr>
         <w:t xml:space="preserve">1. D</w:t>
       </w:r>
       <w:r>
         <w:rPr>
-          <w:rFonts w:ascii="Calibri" w:hAnsi="Calibri" w:cs="Calibri" w:eastAsia="Calibri"/>
-          <w:b/>
-          <w:color w:val="auto"/>
-          <w:spacing w:val="0"/>
-          <w:position w:val="0"/>
-          <w:sz w:val="24"/>
+          <w:rFonts w:ascii="Arial" w:hAnsi="Arial" w:cs="Arial" w:eastAsia="Arial"/>
+          <w:b/>
+          <w:color w:val="auto"/>
+          <w:spacing w:val="0"/>
+          <w:position w:val="0"/>
+          <w:sz w:val="26"/>
           <w:shd w:fill="auto" w:val="clear"/>
         </w:rPr>
         <w:t xml:space="preserve">Ữ LIỆU </w:t>
       </w:r>
       <w:r>
         <w:rPr>
-          <w:rFonts w:ascii="Calibri" w:hAnsi="Calibri" w:cs="Calibri" w:eastAsia="Calibri"/>
-          <w:b/>
-          <w:color w:val="auto"/>
-          <w:spacing w:val="0"/>
-          <w:position w:val="0"/>
-          <w:sz w:val="24"/>
+          <w:rFonts w:ascii="Arial" w:hAnsi="Arial" w:cs="Arial" w:eastAsia="Arial"/>
+          <w:b/>
+          <w:color w:val="auto"/>
+          <w:spacing w:val="0"/>
+          <w:position w:val="0"/>
+          <w:sz w:val="26"/>
           <w:shd w:fill="auto" w:val="clear"/>
         </w:rPr>
         <w:t xml:space="preserve">Đ</w:t>
       </w:r>
       <w:r>
         <w:rPr>
-          <w:rFonts w:ascii="Calibri" w:hAnsi="Calibri" w:cs="Calibri" w:eastAsia="Calibri"/>
-          <w:b/>
-          <w:color w:val="auto"/>
-          <w:spacing w:val="0"/>
-          <w:position w:val="0"/>
-          <w:sz w:val="24"/>
+          <w:rFonts w:ascii="Arial" w:hAnsi="Arial" w:cs="Arial" w:eastAsia="Arial"/>
+          <w:b/>
+          <w:color w:val="auto"/>
+          <w:spacing w:val="0"/>
+          <w:position w:val="0"/>
+          <w:sz w:val="26"/>
           <w:shd w:fill="auto" w:val="clear"/>
         </w:rPr>
         <w:t xml:space="preserve">ẦU V</w:t>
       </w:r>
       <w:r>
         <w:rPr>
-          <w:rFonts w:ascii="Calibri" w:hAnsi="Calibri" w:cs="Calibri" w:eastAsia="Calibri"/>
-          <w:b/>
-          <w:color w:val="auto"/>
-          <w:spacing w:val="0"/>
-          <w:position w:val="0"/>
-          <w:sz w:val="24"/>
+          <w:rFonts w:ascii="Arial" w:hAnsi="Arial" w:cs="Arial" w:eastAsia="Arial"/>
+          <w:b/>
+          <w:color w:val="auto"/>
+          <w:spacing w:val="0"/>
+          <w:position w:val="0"/>
+          <w:sz w:val="26"/>
           <w:shd w:fill="auto" w:val="clear"/>
         </w:rPr>
         <w:t xml:space="preserve">ÀO TH</w:t>
       </w:r>
       <w:r>
         <w:rPr>
-          <w:rFonts w:ascii="Calibri" w:hAnsi="Calibri" w:cs="Calibri" w:eastAsia="Calibri"/>
-          <w:b/>
-          <w:color w:val="auto"/>
-          <w:spacing w:val="0"/>
-          <w:position w:val="0"/>
-          <w:sz w:val="24"/>
+          <w:rFonts w:ascii="Arial" w:hAnsi="Arial" w:cs="Arial" w:eastAsia="Arial"/>
+          <w:b/>
+          <w:color w:val="auto"/>
+          <w:spacing w:val="0"/>
+          <w:position w:val="0"/>
+          <w:sz w:val="26"/>
           <w:shd w:fill="auto" w:val="clear"/>
         </w:rPr>
         <w:t xml:space="preserve">ỰC TẾ (RAW DATASETS)</w:t>
@@ -499,7 +501,6 @@
                 <w:color w:val="auto"/>
                 <w:spacing w:val="0"/>
                 <w:position w:val="0"/>
-                <w:shd w:fill="auto" w:val="clear"/>
               </w:rPr>
             </w:pPr>
             <w:r>
@@ -523,70 +524,70 @@
         <w:ind w:right="0" w:left="0" w:firstLine="0"/>
         <w:jc w:val="left"/>
         <w:rPr>
-          <w:rFonts w:ascii="Calibri" w:hAnsi="Calibri" w:cs="Calibri" w:eastAsia="Calibri"/>
-          <w:color w:val="auto"/>
-          <w:spacing w:val="0"/>
-          <w:position w:val="0"/>
-          <w:sz w:val="24"/>
+          <w:rFonts w:ascii="Arial" w:hAnsi="Arial" w:cs="Arial" w:eastAsia="Arial"/>
+          <w:color w:val="auto"/>
+          <w:spacing w:val="0"/>
+          <w:position w:val="0"/>
+          <w:sz w:val="26"/>
           <w:shd w:fill="auto" w:val="clear"/>
         </w:rPr>
       </w:pPr>
       <w:r>
         <w:rPr>
-          <w:rFonts w:ascii="Calibri" w:hAnsi="Calibri" w:cs="Calibri" w:eastAsia="Calibri"/>
-          <w:b/>
-          <w:color w:val="auto"/>
-          <w:spacing w:val="0"/>
-          <w:position w:val="0"/>
-          <w:sz w:val="24"/>
-          <w:shd w:fill="auto" w:val="clear"/>
-        </w:rPr>
-        <w:t xml:space="preserve">2. BÀI 3: </w:t>
-      </w:r>
-      <w:r>
-        <w:rPr>
-          <w:rFonts w:ascii="Calibri" w:hAnsi="Calibri" w:cs="Calibri" w:eastAsia="Calibri"/>
-          <w:b/>
-          <w:color w:val="auto"/>
-          <w:spacing w:val="0"/>
-          <w:position w:val="0"/>
-          <w:sz w:val="24"/>
+          <w:rFonts w:ascii="Arial" w:hAnsi="Arial" w:cs="Arial" w:eastAsia="Arial"/>
+          <w:b/>
+          <w:color w:val="auto"/>
+          <w:spacing w:val="0"/>
+          <w:position w:val="0"/>
+          <w:sz w:val="26"/>
+          <w:shd w:fill="auto" w:val="clear"/>
+        </w:rPr>
+        <w:t xml:space="preserve">2. BÀI 1: </w:t>
+      </w:r>
+      <w:r>
+        <w:rPr>
+          <w:rFonts w:ascii="Arial" w:hAnsi="Arial" w:cs="Arial" w:eastAsia="Arial"/>
+          <w:b/>
+          <w:color w:val="auto"/>
+          <w:spacing w:val="0"/>
+          <w:position w:val="0"/>
+          <w:sz w:val="26"/>
           <w:shd w:fill="auto" w:val="clear"/>
         </w:rPr>
         <w:t xml:space="preserve">Đ</w:t>
       </w:r>
       <w:r>
         <w:rPr>
-          <w:rFonts w:ascii="Calibri" w:hAnsi="Calibri" w:cs="Calibri" w:eastAsia="Calibri"/>
-          <w:b/>
-          <w:color w:val="auto"/>
-          <w:spacing w:val="0"/>
-          <w:position w:val="0"/>
-          <w:sz w:val="24"/>
+          <w:rFonts w:ascii="Arial" w:hAnsi="Arial" w:cs="Arial" w:eastAsia="Arial"/>
+          <w:b/>
+          <w:color w:val="auto"/>
+          <w:spacing w:val="0"/>
+          <w:position w:val="0"/>
+          <w:sz w:val="26"/>
           <w:shd w:fill="auto" w:val="clear"/>
         </w:rPr>
         <w:t xml:space="preserve">ỊNH NGH</w:t>
       </w:r>
       <w:r>
         <w:rPr>
-          <w:rFonts w:ascii="Calibri" w:hAnsi="Calibri" w:cs="Calibri" w:eastAsia="Calibri"/>
-          <w:b/>
-          <w:color w:val="auto"/>
-          <w:spacing w:val="0"/>
-          <w:position w:val="0"/>
-          <w:sz w:val="24"/>
+          <w:rFonts w:ascii="Arial" w:hAnsi="Arial" w:cs="Arial" w:eastAsia="Arial"/>
+          <w:b/>
+          <w:color w:val="auto"/>
+          <w:spacing w:val="0"/>
+          <w:position w:val="0"/>
+          <w:sz w:val="26"/>
           <w:shd w:fill="auto" w:val="clear"/>
         </w:rPr>
         <w:t xml:space="preserve">ĨA PYDANTIC SCHEMAS (10 - 12 PH</w:t>
       </w:r>
       <w:r>
         <w:rPr>
-          <w:rFonts w:ascii="Calibri" w:hAnsi="Calibri" w:cs="Calibri" w:eastAsia="Calibri"/>
-          <w:b/>
-          <w:color w:val="auto"/>
-          <w:spacing w:val="0"/>
-          <w:position w:val="0"/>
-          <w:sz w:val="24"/>
+          <w:rFonts w:ascii="Arial" w:hAnsi="Arial" w:cs="Arial" w:eastAsia="Arial"/>
+          <w:b/>
+          <w:color w:val="auto"/>
+          <w:spacing w:val="0"/>
+          <w:position w:val="0"/>
+          <w:sz w:val="26"/>
           <w:shd w:fill="auto" w:val="clear"/>
         </w:rPr>
         <w:t xml:space="preserve">ÚT)</w:t>
@@ -923,7 +924,7 @@
         <w:rPr>
           <w:rFonts w:ascii="Calibri" w:hAnsi="Calibri" w:cs="Calibri" w:eastAsia="Calibri"/>
           <w:b/>
-          <w:color w:val="auto"/>
+          <w:color w:val="00B050"/>
           <w:spacing w:val="0"/>
           <w:position w:val="0"/>
           <w:sz w:val="22"/>
@@ -935,7 +936,7 @@
         <w:rPr>
           <w:rFonts w:ascii="Calibri" w:hAnsi="Calibri" w:cs="Calibri" w:eastAsia="Calibri"/>
           <w:b/>
-          <w:color w:val="auto"/>
+          <w:color w:val="00B050"/>
           <w:spacing w:val="0"/>
           <w:position w:val="0"/>
           <w:sz w:val="22"/>
@@ -947,7 +948,7 @@
         <w:rPr>
           <w:rFonts w:ascii="Calibri" w:hAnsi="Calibri" w:cs="Calibri" w:eastAsia="Calibri"/>
           <w:b/>
-          <w:color w:val="auto"/>
+          <w:color w:val="00B050"/>
           <w:spacing w:val="0"/>
           <w:position w:val="0"/>
           <w:sz w:val="22"/>
@@ -959,7 +960,7 @@
         <w:rPr>
           <w:rFonts w:ascii="Calibri" w:hAnsi="Calibri" w:cs="Calibri" w:eastAsia="Calibri"/>
           <w:b/>
-          <w:color w:val="auto"/>
+          <w:color w:val="00B050"/>
           <w:spacing w:val="0"/>
           <w:position w:val="0"/>
           <w:sz w:val="22"/>
@@ -1215,7 +1216,6 @@
                 <w:color w:val="auto"/>
                 <w:spacing w:val="0"/>
                 <w:position w:val="0"/>
-                <w:shd w:fill="auto" w:val="clear"/>
               </w:rPr>
             </w:pPr>
             <w:r>
@@ -1239,70 +1239,70 @@
         <w:ind w:right="0" w:left="0" w:firstLine="0"/>
         <w:jc w:val="left"/>
         <w:rPr>
-          <w:rFonts w:ascii="Calibri" w:hAnsi="Calibri" w:cs="Calibri" w:eastAsia="Calibri"/>
-          <w:color w:val="auto"/>
-          <w:spacing w:val="0"/>
-          <w:position w:val="0"/>
-          <w:sz w:val="24"/>
+          <w:rFonts w:ascii="Arial" w:hAnsi="Arial" w:cs="Arial" w:eastAsia="Arial"/>
+          <w:color w:val="auto"/>
+          <w:spacing w:val="0"/>
+          <w:position w:val="0"/>
+          <w:sz w:val="26"/>
           <w:shd w:fill="auto" w:val="clear"/>
         </w:rPr>
       </w:pPr>
       <w:r>
         <w:rPr>
-          <w:rFonts w:ascii="Calibri" w:hAnsi="Calibri" w:cs="Calibri" w:eastAsia="Calibri"/>
-          <w:b/>
-          <w:color w:val="auto"/>
-          <w:spacing w:val="0"/>
-          <w:position w:val="0"/>
-          <w:sz w:val="24"/>
-          <w:shd w:fill="auto" w:val="clear"/>
-        </w:rPr>
-        <w:t xml:space="preserve">3. BÀI 4: XÂY D</w:t>
-      </w:r>
-      <w:r>
-        <w:rPr>
-          <w:rFonts w:ascii="Calibri" w:hAnsi="Calibri" w:cs="Calibri" w:eastAsia="Calibri"/>
-          <w:b/>
-          <w:color w:val="auto"/>
-          <w:spacing w:val="0"/>
-          <w:position w:val="0"/>
-          <w:sz w:val="24"/>
+          <w:rFonts w:ascii="Arial" w:hAnsi="Arial" w:cs="Arial" w:eastAsia="Arial"/>
+          <w:b/>
+          <w:color w:val="auto"/>
+          <w:spacing w:val="0"/>
+          <w:position w:val="0"/>
+          <w:sz w:val="26"/>
+          <w:shd w:fill="auto" w:val="clear"/>
+        </w:rPr>
+        <w:t xml:space="preserve">3. BÀI 2: XÂY D</w:t>
+      </w:r>
+      <w:r>
+        <w:rPr>
+          <w:rFonts w:ascii="Arial" w:hAnsi="Arial" w:cs="Arial" w:eastAsia="Arial"/>
+          <w:b/>
+          <w:color w:val="auto"/>
+          <w:spacing w:val="0"/>
+          <w:position w:val="0"/>
+          <w:sz w:val="26"/>
           <w:shd w:fill="auto" w:val="clear"/>
         </w:rPr>
         <w:t xml:space="preserve">ỰNG API ENDPOINTS TH</w:t>
       </w:r>
       <w:r>
         <w:rPr>
-          <w:rFonts w:ascii="Calibri" w:hAnsi="Calibri" w:cs="Calibri" w:eastAsia="Calibri"/>
-          <w:b/>
-          <w:color w:val="auto"/>
-          <w:spacing w:val="0"/>
-          <w:position w:val="0"/>
-          <w:sz w:val="24"/>
+          <w:rFonts w:ascii="Arial" w:hAnsi="Arial" w:cs="Arial" w:eastAsia="Arial"/>
+          <w:b/>
+          <w:color w:val="auto"/>
+          <w:spacing w:val="0"/>
+          <w:position w:val="0"/>
+          <w:sz w:val="26"/>
           <w:shd w:fill="auto" w:val="clear"/>
         </w:rPr>
         <w:t xml:space="preserve">ÊM SÁCH &amp; L</w:t>
       </w:r>
       <w:r>
         <w:rPr>
-          <w:rFonts w:ascii="Calibri" w:hAnsi="Calibri" w:cs="Calibri" w:eastAsia="Calibri"/>
-          <w:b/>
-          <w:color w:val="auto"/>
-          <w:spacing w:val="0"/>
-          <w:position w:val="0"/>
-          <w:sz w:val="24"/>
+          <w:rFonts w:ascii="Arial" w:hAnsi="Arial" w:cs="Arial" w:eastAsia="Arial"/>
+          <w:b/>
+          <w:color w:val="auto"/>
+          <w:spacing w:val="0"/>
+          <w:position w:val="0"/>
+          <w:sz w:val="26"/>
           <w:shd w:fill="auto" w:val="clear"/>
         </w:rPr>
         <w:t xml:space="preserve">ẤY CHI TIẾT S</w:t>
       </w:r>
       <w:r>
         <w:rPr>
-          <w:rFonts w:ascii="Calibri" w:hAnsi="Calibri" w:cs="Calibri" w:eastAsia="Calibri"/>
-          <w:b/>
-          <w:color w:val="auto"/>
-          <w:spacing w:val="0"/>
-          <w:position w:val="0"/>
-          <w:sz w:val="24"/>
+          <w:rFonts w:ascii="Arial" w:hAnsi="Arial" w:cs="Arial" w:eastAsia="Arial"/>
+          <w:b/>
+          <w:color w:val="auto"/>
+          <w:spacing w:val="0"/>
+          <w:position w:val="0"/>
+          <w:sz w:val="26"/>
           <w:shd w:fill="auto" w:val="clear"/>
         </w:rPr>
         <w:t xml:space="preserve">ÁCH (10 - 13 PHÚT)</w:t>
@@ -1863,7 +1863,7 @@
         <w:jc w:val="left"/>
         <w:rPr>
           <w:rFonts w:ascii="Calibri" w:hAnsi="Calibri" w:cs="Calibri" w:eastAsia="Calibri"/>
-          <w:color w:val="auto"/>
+          <w:color w:val="00B050"/>
           <w:spacing w:val="0"/>
           <w:position w:val="0"/>
           <w:sz w:val="22"/>
@@ -1874,7 +1874,7 @@
         <w:rPr>
           <w:rFonts w:ascii="Calibri" w:hAnsi="Calibri" w:cs="Calibri" w:eastAsia="Calibri"/>
           <w:b/>
-          <w:color w:val="auto"/>
+          <w:color w:val="00B050"/>
           <w:spacing w:val="0"/>
           <w:position w:val="0"/>
           <w:sz w:val="22"/>
@@ -1886,7 +1886,7 @@
         <w:rPr>
           <w:rFonts w:ascii="Calibri" w:hAnsi="Calibri" w:cs="Calibri" w:eastAsia="Calibri"/>
           <w:b/>
-          <w:color w:val="auto"/>
+          <w:color w:val="00B050"/>
           <w:spacing w:val="0"/>
           <w:position w:val="0"/>
           <w:sz w:val="22"/>
@@ -1898,7 +1898,7 @@
         <w:rPr>
           <w:rFonts w:ascii="Calibri" w:hAnsi="Calibri" w:cs="Calibri" w:eastAsia="Calibri"/>
           <w:b/>
-          <w:color w:val="auto"/>
+          <w:color w:val="00B050"/>
           <w:spacing w:val="0"/>
           <w:position w:val="0"/>
           <w:sz w:val="22"/>
@@ -1910,7 +1910,7 @@
         <w:rPr>
           <w:rFonts w:ascii="Calibri" w:hAnsi="Calibri" w:cs="Calibri" w:eastAsia="Calibri"/>
           <w:b/>
-          <w:color w:val="auto"/>
+          <w:color w:val="00B050"/>
           <w:spacing w:val="0"/>
           <w:position w:val="0"/>
           <w:sz w:val="22"/>
@@ -2376,7 +2376,6 @@
                 <w:color w:val="auto"/>
                 <w:spacing w:val="0"/>
                 <w:position w:val="0"/>
-                <w:shd w:fill="auto" w:val="clear"/>
               </w:rPr>
             </w:pPr>
             <w:r>
@@ -2807,7 +2806,7 @@
           <w:sz w:val="22"/>
           <w:shd w:fill="auto" w:val="clear"/>
         </w:rPr>
-        <w:t xml:space="preserve">ài 05:</w:t>
+        <w:t xml:space="preserve">ài 06:</w:t>
       </w:r>
     </w:p>
     <w:p>
@@ -2906,29 +2905,7 @@
           <w:sz w:val="22"/>
           <w:shd w:fill="auto" w:val="clear"/>
         </w:rPr>
-        <w:t xml:space="preserve">ọc Day </w:t>
-      </w:r>
-      <w:r>
-        <w:rPr>
-          <w:rFonts w:ascii="Calibri" w:hAnsi="Calibri" w:cs="Calibri" w:eastAsia="Calibri"/>
-          <w:color w:val="auto"/>
-          <w:spacing w:val="0"/>
-          <w:position w:val="0"/>
-          <w:sz w:val="22"/>
-          <w:shd w:fill="auto" w:val="clear"/>
-        </w:rPr>
-        <w:t xml:space="preserve">6</w:t>
-      </w:r>
-      <w:r>
-        <w:rPr>
-          <w:rFonts w:ascii="Calibri" w:hAnsi="Calibri" w:cs="Calibri" w:eastAsia="Calibri"/>
-          <w:color w:val="auto"/>
-          <w:spacing w:val="0"/>
-          <w:position w:val="0"/>
-          <w:sz w:val="22"/>
-          <w:shd w:fill="auto" w:val="clear"/>
-        </w:rPr>
-        <w:t xml:space="preserve">, cuộn xuống Mục Nộp B</w:t>
+        <w:t xml:space="preserve">ọc Day 6, cuộn xuống Mục Nộp B</w:t>
       </w:r>
       <w:r>
         <w:rPr>

</xml_diff>